<commit_message>
please let this be the last one
</commit_message>
<xml_diff>
--- a/report.docx
+++ b/report.docx
@@ -802,7 +802,19 @@
         <w:rPr>
           <w:rFonts w:ascii="Times New Roman" w:hAnsi="Times New Roman" w:cs="Times New Roman"/>
         </w:rPr>
-        <w:t xml:space="preserve"> exceeds precision on the test </w:t>
+        <w:t xml:space="preserve"> exceeds </w:t>
+      </w:r>
+      <w:r>
+        <w:rPr>
+          <w:rFonts w:ascii="Times New Roman" w:hAnsi="Times New Roman" w:cs="Times New Roman"/>
+        </w:rPr>
+        <w:t>P</w:t>
+      </w:r>
+      <w:r>
+        <w:rPr>
+          <w:rFonts w:ascii="Times New Roman" w:hAnsi="Times New Roman" w:cs="Times New Roman"/>
+        </w:rPr>
+        <w:t xml:space="preserve">recision on the test </w:t>
       </w:r>
       <w:r>
         <w:rPr>
@@ -1760,10 +1772,10 @@
         </w:rPr>
         <w:lastRenderedPageBreak/>
         <w:drawing>
-          <wp:inline distT="0" distB="0" distL="0" distR="0" wp14:anchorId="47281A83" wp14:editId="65AC9F46">
-            <wp:extent cx="1980000" cy="1857600"/>
-            <wp:effectExtent l="0" t="0" r="1270" b="0"/>
-            <wp:docPr id="1294297790" name="Picture 4" descr="A graph of survival plot&#10;&#10;AI-generated content may be incorrect."/>
+          <wp:inline distT="0" distB="0" distL="0" distR="0" wp14:anchorId="47281A83" wp14:editId="2A8C514E">
+            <wp:extent cx="1978223" cy="1857600"/>
+            <wp:effectExtent l="0" t="0" r="3175" b="0"/>
+            <wp:docPr id="1294297790" name="Picture 4"/>
             <wp:cNvGraphicFramePr>
               <a:graphicFrameLocks xmlns:a="http://schemas.openxmlformats.org/drawingml/2006/main" noChangeAspect="1"/>
             </wp:cNvGraphicFramePr>
@@ -1771,7 +1783,7 @@
               <a:graphicData uri="http://schemas.openxmlformats.org/drawingml/2006/picture">
                 <pic:pic xmlns:pic="http://schemas.openxmlformats.org/drawingml/2006/picture">
                   <pic:nvPicPr>
-                    <pic:cNvPr id="1294297790" name="Picture 4" descr="A graph of survival plot&#10;&#10;AI-generated content may be incorrect."/>
+                    <pic:cNvPr id="1294297790" name="Picture 4"/>
                     <pic:cNvPicPr/>
                   </pic:nvPicPr>
                   <pic:blipFill>
@@ -1789,7 +1801,7 @@
                   <pic:spPr>
                     <a:xfrm>
                       <a:off x="0" y="0"/>
-                      <a:ext cx="1980000" cy="1857600"/>
+                      <a:ext cx="1978223" cy="1857600"/>
                     </a:xfrm>
                     <a:prstGeom prst="rect">
                       <a:avLst/>
@@ -1807,10 +1819,10 @@
           <w:noProof/>
         </w:rPr>
         <w:drawing>
-          <wp:inline distT="0" distB="0" distL="0" distR="0" wp14:anchorId="1F006ACF" wp14:editId="49192BA8">
-            <wp:extent cx="1980000" cy="1857600"/>
-            <wp:effectExtent l="0" t="0" r="1270" b="0"/>
-            <wp:docPr id="1361376801" name="Picture 3" descr="A graph of a survival plot&#10;&#10;AI-generated content may be incorrect."/>
+          <wp:inline distT="0" distB="0" distL="0" distR="0" wp14:anchorId="1F006ACF" wp14:editId="1C85D40F">
+            <wp:extent cx="1978223" cy="1857600"/>
+            <wp:effectExtent l="0" t="0" r="3175" b="0"/>
+            <wp:docPr id="1361376801" name="Picture 3"/>
             <wp:cNvGraphicFramePr>
               <a:graphicFrameLocks xmlns:a="http://schemas.openxmlformats.org/drawingml/2006/main" noChangeAspect="1"/>
             </wp:cNvGraphicFramePr>
@@ -1818,7 +1830,7 @@
               <a:graphicData uri="http://schemas.openxmlformats.org/drawingml/2006/picture">
                 <pic:pic xmlns:pic="http://schemas.openxmlformats.org/drawingml/2006/picture">
                   <pic:nvPicPr>
-                    <pic:cNvPr id="1361376801" name="Picture 3" descr="A graph of a survival plot&#10;&#10;AI-generated content may be incorrect."/>
+                    <pic:cNvPr id="1361376801" name="Picture 3"/>
                     <pic:cNvPicPr/>
                   </pic:nvPicPr>
                   <pic:blipFill>
@@ -1836,7 +1848,7 @@
                   <pic:spPr>
                     <a:xfrm>
                       <a:off x="0" y="0"/>
-                      <a:ext cx="1980000" cy="1857600"/>
+                      <a:ext cx="1978223" cy="1857600"/>
                     </a:xfrm>
                     <a:prstGeom prst="rect">
                       <a:avLst/>
@@ -1854,10 +1866,10 @@
           <w:noProof/>
         </w:rPr>
         <w:drawing>
-          <wp:inline distT="0" distB="0" distL="0" distR="0" wp14:anchorId="2201F6F6" wp14:editId="428D7DA0">
-            <wp:extent cx="1980000" cy="1857600"/>
-            <wp:effectExtent l="0" t="0" r="1270" b="0"/>
-            <wp:docPr id="325965315" name="Picture 2" descr="A graph of data survival&#10;&#10;AI-generated content may be incorrect."/>
+          <wp:inline distT="0" distB="0" distL="0" distR="0" wp14:anchorId="2201F6F6" wp14:editId="41CACF77">
+            <wp:extent cx="1978223" cy="1857600"/>
+            <wp:effectExtent l="0" t="0" r="3175" b="0"/>
+            <wp:docPr id="325965315" name="Picture 2"/>
             <wp:cNvGraphicFramePr>
               <a:graphicFrameLocks xmlns:a="http://schemas.openxmlformats.org/drawingml/2006/main" noChangeAspect="1"/>
             </wp:cNvGraphicFramePr>
@@ -1865,7 +1877,7 @@
               <a:graphicData uri="http://schemas.openxmlformats.org/drawingml/2006/picture">
                 <pic:pic xmlns:pic="http://schemas.openxmlformats.org/drawingml/2006/picture">
                   <pic:nvPicPr>
-                    <pic:cNvPr id="325965315" name="Picture 2" descr="A graph of data survival&#10;&#10;AI-generated content may be incorrect."/>
+                    <pic:cNvPr id="325965315" name="Picture 2"/>
                     <pic:cNvPicPr/>
                   </pic:nvPicPr>
                   <pic:blipFill>
@@ -1883,7 +1895,7 @@
                   <pic:spPr>
                     <a:xfrm>
                       <a:off x="0" y="0"/>
-                      <a:ext cx="1980000" cy="1857600"/>
+                      <a:ext cx="1978223" cy="1857600"/>
                     </a:xfrm>
                     <a:prstGeom prst="rect">
                       <a:avLst/>
@@ -5627,7 +5639,7 @@
 </file>
 
 <file path=customXml/itemProps1.xml><?xml version="1.0" encoding="utf-8"?>
-<ds:datastoreItem xmlns:ds="http://schemas.openxmlformats.org/officeDocument/2006/customXml" ds:itemID="{F270946C-0EF0-A84F-B4A1-6386D8E3620E}">
+<ds:datastoreItem xmlns:ds="http://schemas.openxmlformats.org/officeDocument/2006/customXml" ds:itemID="{249A6777-A8E4-E14B-9BC1-2F8785D5A096}">
   <ds:schemaRefs>
     <ds:schemaRef ds:uri="http://schemas.openxmlformats.org/officeDocument/2006/bibliography"/>
   </ds:schemaRefs>

</xml_diff>